<commit_message>
Ch29-30 ending fixes: Elara's close, silence binding, orphaned setups
- Ch29: the Master's one lie visible, ridge fixed, Ancient One sits, recycled images and recaps trimmed
- Ch30: Elara to the Master ('It is mine, Monitor'); Elara-Camilla at the lift (pays off 'Later.'); Teresa at the window
- Ch30: 'What was named in this room stays in it'; witness on the page; Flitzberg on the arm; Gage-Otto beat
- Ch30: timeline anchored (last scene N14); pact direction; listener under the lake; wrench, brass pin, Jeebh, four names, four notes
- Canon table N12-N14; Book 3 hooks in notes

Co-Authored-By: Claude Opus 5.5 <noreply@anthropic.com>
</commit_message>
<xml_diff>
--- a/claude-notes/manuscript-v2/29-bare-wrist-merged.docx
+++ b/claude-notes/manuscript-v2/29-bare-wrist-merged.docx
@@ -59,7 +59,7 @@
           <w:b w:val="0"/>
           <w:i w:val="0"/>
         </w:rPr>
-        <w:t>He didn't stand. The other three had come up out of their chairs when the far door opened, the Arthashastri quickly, the Dhammapala like a woman rising from a mat, the Ancient One in her two movements, a hand on the table's edge and then the rest. Flitzberg had come round the curve of the table and stopped with his hands at his sides. The Master stayed where he was, his bare hands on the wood, his rings in their row in front of them. The smallest had come to rest on its edge instead of lying flat. It stood up on the table in the circle of lamplight, a thin gold hoop, like a coin someone had spun and walked away from. Nobody had righted it.</w:t>
+        <w:t>He didn't stand. The other three had come up out of their chairs when the far door opened, the Arthashastri quickly, the Dhammapala without a sound, the Ancient One last, a hand on the table's edge first. Flitzberg had come round the curve of the table and stopped with his hands at his sides. The Master stayed where he was, his bare hands on the wood, his rings in their row in front of them. The smallest had come to rest on its edge instead of lying flat. It stood up on the table in the circle of lamplight, a thin gold hoop, like a coin someone had spun and walked away from. Nobody had righted it.</w:t>
       </w:r>
     </w:p>
     <w:p>
@@ -95,7 +95,7 @@
           <w:b w:val="0"/>
           <w:i w:val="0"/>
         </w:rPr>
-        <w:t>"This is Daren," the Master said. He used the voice he kept for ledgers due on the tenth. "Formerly of Kubera. Struck from my house's rolls this season, in a chamber some of you have stood in. Kubera has kept a sealed box for a century, and sworn to this table that what lay in it was a relic. A month after he was struck, the box was opened by a hand that had no seal to open it with. What lay in it is on his right wrist. He has worn it since."</w:t>
+        <w:t>"This is Daren," the Master said. He used the voice he kept for the reading of accounts. "Formerly of Kubera. Struck from my house's rolls this season, in a chamber some of you have stood in. Kubera has kept a sealed box for a century, and sworn to this table that what lay in it was a relic. A month after he was struck, the box was opened by a hand that had no seal to open it with. What lay in it is on his right wrist. He has worn it since."</w:t>
       </w:r>
     </w:p>
     <w:p>
@@ -122,7 +122,7 @@
           <w:b w:val="0"/>
           <w:i w:val="0"/>
         </w:rPr>
-        <w:t>It was clean. Daren heard how clean it was. Every line of it was true, and every line was laid edge to edge with the next, so that there was no gap anywhere for the line under them to show through. A struck officer. A sealed box. A wrist. The old man had built it the way he peeled a pear, in one unbroken strip, and when he set the knife down there would be nothing left of Daren on the plate but the part the table could eat.</w:t>
+        <w:t>It was clean. Daren heard how clean it was. Nearly every line of it was true, and the one that wasn't was laid so flush against the rest that there was no gap anywhere for it to show through. A struck officer. A sealed box. A wrist. The old man had built it the way he peeled a pear, in one unbroken strip, and when he set the knife down there would be nothing left of Daren on the plate but the part the table could eat.</w:t>
       </w:r>
     </w:p>
     <w:p>
@@ -150,7 +150,7 @@
           <w:b w:val="0"/>
           <w:i w:val="0"/>
         </w:rPr>
-        <w:t>His throat closed. His stomach had gone first, as it always did, and now his throat followed it and sat tight under his jaw. His right hand had been open since the train. He felt the fingers begin to curl, and he opened them, and they curled again, slower, drawn closed by a string tied somewhere up inside the arm.</w:t>
+        <w:t>His throat closed. His stomach had gone first, as it always did, and now his throat followed. His right hand had been open since the train. He felt the fingers begin to curl, and he opened them, and they curled again, slower, drawn closed by a string tied somewhere up inside the arm.</w:t>
       </w:r>
     </w:p>
     <w:p>
@@ -267,7 +267,7 @@
           <w:b w:val="0"/>
           <w:i w:val="0"/>
         </w:rPr>
-        <w:t>Close to, the man was younger than he'd looked in the corridor. Older than Gage, not by much. The coat was buttoned to the throat, and the top button was a different black from the rest, sewn on with thread that didn't match. The man's left hand was pressed over a soft square shape inside the coat, a book or a wallet, holding it to his ribs. He smelled of dust and cold rust, the smell of a stair nobody used.</w:t>
+        <w:t>Close to, the man was younger than he'd looked in the corridor. Older than Gage, not by much. The coat was done up to the top, and the top button was a different black from the rest, sewn on with thread that didn't match. The man's left hand was pressed over a soft square shape inside the coat, a book or a wallet, holding it to his ribs. He smelled of dust and cold rust, the smell of a stair nobody used.</w:t>
       </w:r>
     </w:p>
     <w:p>
@@ -376,7 +376,7 @@
           <w:b w:val="0"/>
           <w:i w:val="0"/>
         </w:rPr>
-        <w:t>Along the backs of his hands, where the lamp caught them, there was a faint blue. A shimmer, heat off a slag heap. He didn't call it up. It was there like his pulse was there.</w:t>
+        <w:t>Along the backs of his hands, where the lamp caught them, there was a faint blue. The shimmer he'd watched at an old man's knee. He didn't call it up. It was there like his pulse was there.</w:t>
       </w:r>
     </w:p>
     <w:p>
@@ -403,7 +403,7 @@
           <w:b w:val="0"/>
           <w:i w:val="0"/>
         </w:rPr>
-        <w:t>The man's eyes had gone past Otto's shoulder. Otto didn't have to turn to know where. The thing on the wrist had let go of him and gone back to leaning, hard, toward the old man at the table, and the man's fingers were curling again round nothing, and his face had the look Otto had seen on Ben's face once, at the bottom of a shaft, when the rope above him began to fray.</w:t>
+        <w:t>The man's eyes had gone past Otto's shoulder. Otto didn't have to turn to know where. The thing on the wrist had let go of him and gone back to leaning, hard, toward the old man at the table, and the man's fingers were curling again round nothing, and his face had the look of someone listening for a count that had stopped.</w:t>
       </w:r>
     </w:p>
     <w:p>
@@ -457,7 +457,7 @@
           <w:b w:val="0"/>
           <w:i w:val="0"/>
         </w:rPr>
-        <w:t>She'd felt the arm do things on its own twice before. Both times it had felt like a twitch. This felt like a word in a language she half knew, said too fast.</w:t>
+        <w:t>She'd felt the arm do things on its own before: a twitch, a fist on a desk a few minutes ago. This felt like a word in a language she half knew, said too fast.</w:t>
       </w:r>
     </w:p>
     <w:p>
@@ -529,7 +529,7 @@
           <w:b w:val="0"/>
           <w:i w:val="0"/>
         </w:rPr>
-        <w:t>She'd spent her whole life being the one nobody looked at. A girl on a ration card. Eyes on everybody else's gauges. Now the whole room was on her, and on the arm, and a few minutes ago a stranger had told her that somewhere above the city a wall had been reading every twitch of her fingers since the day it was fitted. The cups. The egg. Every morning she'd made a fist and opened it again, someone had written it down.</w:t>
+        <w:t>She'd spent her whole life being the one nobody looked at. A girl on a ration card. Eyes on everybody else's gauges. Now the whole room was on her, and on the arm, and so was a wall somewhere above the city. The cups. The egg. Every morning she'd made a fist and opened it again, someone had written it down.</w:t>
       </w:r>
     </w:p>
     <w:p>
@@ -547,7 +547,7 @@
           <w:b w:val="0"/>
           <w:i w:val="0"/>
         </w:rPr>
-        <w:t>She found that it didn't matter. That was the odd thing. It sat in her chest and went cold and steady, a stone in a stream. They'd been watching her hand for weeks, and every one of those weeks the hand had been hers. It had learned an egg without breaking it. It had held a splinter tonight without cracking it any further. Nobody reading it had made it do one thing.</w:t>
+        <w:t>She found that it didn't matter. That was the odd thing. It sat in her chest, cold and steady. They'd been watching her hand for weeks, and every one of those weeks the hand had been hers. It had learned an egg without breaking it. It had held a splinter tonight without cracking it any further. Nobody reading it had made it do one thing.</w:t>
       </w:r>
     </w:p>
     <w:p>
@@ -693,7 +693,7 @@
           <w:b w:val="0"/>
           <w:i w:val="0"/>
         </w:rPr>
-        <w:t>The band was warm, and then, as it came away from the skin, it wasn't. It came off cold, all at once, the cold of a stone taken out of a river, and the lamp over the table stopped humming in the same instant, so that the quiet afterward was loud. The chain hung still. The bar in the door behind him settled into its bracket with a soft knock and didn't move again.</w:t>
+        <w:t>The band was warm, and then, as it came away from the skin, it wasn't. It came off cold, all at once, the cold of a stone taken out of a river, and the lamp over the table stopped humming in the same instant, so that the quiet afterward was loud. The chain hung still. The bar in the door behind him settled into its bracket with a soft knock and didn't move again. At the table, the Ancient One sat down.</w:t>
       </w:r>
     </w:p>
     <w:p>
@@ -711,7 +711,7 @@
           <w:b w:val="0"/>
           <w:i w:val="0"/>
         </w:rPr>
-        <w:t>Pale. Paler than the rest of the arm, a band of skin that hadn't seen light since a chamber with black doors. The fine grain of the obsidian's inner face was printed into it, like a crease left on a cheek by a sheet. And the old ridge where Kubera's gold had sat against the heel of the hand, and above it a new one, lower, not yet finished. It looked like something half built and left out in the weather. It was bare.</w:t>
+        <w:t>Pale. Paler than the rest of the arm, a band of skin that hadn't seen light since a chamber with black doors. The fine grain of the obsidian's inner face was printed into it, like a crease left on a cheek by a sheet. And the old ridge where Kubera's gold had sat against the heel of the hand, and a finger above it a new one, shallower, not yet finished. It looked like something half built and left out in the weather. It was bare.</w:t>
       </w:r>
     </w:p>
     <w:p>
@@ -747,7 +747,7 @@
           <w:b w:val="0"/>
           <w:i w:val="0"/>
         </w:rPr>
-        <w:t>Then Daren unbuttoned his coat, the top button first, the one that didn't match, and took the notebook out of the inside pocket. The cover had gone soft as cloth. The pencil stub was still pushed down into the spine, its end chewed flat by teeth that weren't his. He put it down next to the band, square to the table's edge, and took his hand off it.</w:t>
+        <w:t>Then Daren unbuttoned his coat, the top button first, the one that didn't match, and took the notebook out of the inside pocket. He put it down next to the band, square to the table's edge, and took his hand off it.</w:t>
       </w:r>
     </w:p>
     <w:p>
@@ -810,7 +810,7 @@
           <w:b w:val="0"/>
           <w:i w:val="0"/>
         </w:rPr>
-        <w:t>The name sat in the room. Daren heard it go into the stone, the swept floor, the long dark glass, the round walls that had been built to keep their doors told to no one. A room that listened. It had been said aloud in one now.</w:t>
+        <w:t>The name sat in the room. Daren heard it go into the stone, the swept floor, the long dark glass, the round walls that had been built to keep their doors told to no one.</w:t>
       </w:r>
     </w:p>
     <w:p>
@@ -819,7 +819,7 @@
           <w:b w:val="0"/>
           <w:i w:val="0"/>
         </w:rPr>
-        <w:t>Rohan had come down in his red-black with no insignia, and there was rock dust on both his knees and a long grey smear of it up one sleeve. The runner's lift. It went further than three floors. He'd said he wouldn't use it unless the night broke, and Elara hadn't believed him, and the night had broken, and here he was.</w:t>
+        <w:t>Rohan had come down in his red-black with no insignia, and there was rock dust on both his knees and a long grey smear of it up one sleeve. The runner's lift. It went further than three floors.</w:t>
       </w:r>
     </w:p>
     <w:p>
@@ -874,7 +874,7 @@
           <w:b w:val="0"/>
           <w:i w:val="0"/>
         </w:rPr>
-        <w:t>She didn't touch him. She stood in front of him at arm's length, close enough that he'd have to go round her or through her, and she put her hands at her sides where he could see them. She'd never stood in front of him before. She'd stood beside him in a recess with their wrists bare and listened to the rib catch on his breathing. She'd sat across a lantern from him. She'd never been the thing between Rohan and where he meant to go.</w:t>
+        <w:t>She didn't touch him. She stood in front of him at arm's length, close enough that he'd have to go round her or through her, and she put her hands at her sides where he could see them. She'd never stood in front of him before. She'd sat across a lantern from him. She'd never been the thing between Rohan and where he meant to go.</w:t>
       </w:r>
     </w:p>
     <w:p>
@@ -1000,7 +1000,7 @@
           <w:b w:val="0"/>
           <w:i w:val="0"/>
         </w:rPr>
-        <w:t>Rohan's fist didn't open. It didn't lift either. It stayed where it was at his side, closed, the bead of dark running down the knuckle into the crease of his finger, and he stood with it there, and didn't take the last step.</w:t>
+        <w:t>Rohan's fist stayed closed at his side, the bead of dark running down the knuckle into the crease of his finger, and he stood with it there, and didn't take the last step.</w:t>
       </w:r>
     </w:p>
     <w:p>
@@ -1046,15 +1046,6 @@
           <w:i w:val="0"/>
         </w:rPr>
         <w:t>The Arthashastri sat down, slowly, his knees deciding for him.</w:t>
-      </w:r>
-    </w:p>
-    <w:p>
-      <w:r>
-        <w:rPr>
-          <w:b w:val="0"/>
-          <w:i w:val="0"/>
-        </w:rPr>
-        <w:t>The Ancient One stayed standing.</w:t>
       </w:r>
     </w:p>
     <w:p>

</xml_diff>

<commit_message>
Ch29 round 2: Camilla remembers Gage; her open hand moves Daren; lecture and similes cut; continuity
Co-Authored-By: Claude Opus 5.5 <noreply@anthropic.com>
</commit_message>
<xml_diff>
--- a/claude-notes/manuscript-v2/29-bare-wrist-merged.docx
+++ b/claude-notes/manuscript-v2/29-bare-wrist-merged.docx
@@ -133,7 +133,7 @@
           <w:i w:val="0"/>
           <w:strike w:val="0"/>
         </w:rPr>
-        <w:t>It was clean. Daren heard how clean it was. Nearly every line of it was true, and the one that wasn't was laid so flush against the rest that there was no gap anywhere for it to show through. A struck officer. A sealed box. A wrist. The old man had built it the way he peeled a pear, in one unbroken strip, and when he set the knife down there would be nothing left of Daren on the plate but the part the table could eat.</w:t>
+        <w:t>It was clean. Daren heard how clean it was. Nearly every line of it was true, and the one that wasn't was laid so flush against the rest that there was no gap anywhere for it to show through. A struck officer. A sealed box. A wrist. The old man had built it the way he peeled a pear, in one unbroken strip. Daren was the core.</w:t>
       </w:r>
     </w:p>
     <w:p>
@@ -214,7 +214,7 @@
           <w:i w:val="0"/>
           <w:strike w:val="0"/>
         </w:rPr>
-        <w:t>It was leaning. He could feel it leaning, the whole warm weight of it pulling down his arm toward the far side of the table, toward the old man under the lamp, like a dog on a lead.</w:t>
+        <w:t>It was leaning. He could feel it leaning, the whole warm weight of it pulling down his arm toward the far side of the table, toward the old man under the lamp. It had already decided.</w:t>
       </w:r>
     </w:p>
     <w:p>
@@ -264,7 +264,7 @@
           <w:i w:val="0"/>
           <w:strike w:val="0"/>
         </w:rPr>
-        <w:t>He knew rooms. He'd spent two years in a shed learning what a room was doing before it did it, and weeks in the blue learning nothing else, and this room had been doing one thing since the old man in gold began to talk. It had been tightening. The air at the table had gone thick and close, a pot with the lid on, and now the lamp was singing, and the man in the doorway was standing very straight with his right arm held out from his side and his left hand flat on his chest.</w:t>
+        <w:t>He knew rooms. He'd spent two years in a shed learning what a room was doing before it did it, and weeks in the blue learning nothing else, and this room had been doing one thing since the old man in gold began to talk. It had been tightening. The air at the table had gone thick and close, and now the lamp was singing, and the man in the doorway was standing very straight with his right arm held out from his side and his left hand flat on his chest.</w:t>
       </w:r>
     </w:p>
     <w:p>
@@ -355,7 +355,7 @@
           <w:i w:val="0"/>
           <w:strike w:val="0"/>
         </w:rPr>
-        <w:t>He'd held ten stones open over a lake of fire and let them close over himself. He'd been to the bottom of the stillness and found it had no bottom, and he'd stood there a long time. After that, a man in a buttoned coat in a clean room was not very much.</w:t>
+        <w:t>He'd held ten stones open over a floor of fire until it dropped him. He'd been to the bottom of the stillness and found it had no bottom, and he'd stood there a long time. After that, a man in a buttoned coat in a clean room was not very much.</w:t>
       </w:r>
     </w:p>
     <w:p>
@@ -435,7 +435,7 @@
           <w:i w:val="0"/>
           <w:strike w:val="0"/>
         </w:rPr>
-        <w:t>Something settled on the back of his left hand. It weighed nothing. He didn't look down at it, because he knew what he'd see, which was his own hand and nothing on it, and he didn't need to see that.</w:t>
+        <w:t>Something settled on the back of his left hand. It weighed nothing. He didn't look down. He knew what he'd see: his own hand, and nothing on it.</w:t>
       </w:r>
     </w:p>
     <w:p>
@@ -505,7 +505,7 @@
           <w:i w:val="0"/>
           <w:strike w:val="0"/>
         </w:rPr>
-        <w:t>She'd run the whole corridor. Her chest was going like a bellows and her good fist was tight on Gage's splinter, and the earpiece cord had left a red spiral round her wrist that she could still feel. She'd stopped in the doorway behind Otto because the room had stopped her: the low lamp, the old faces, the man in black in the far door. And the arm had started to lift.</w:t>
+        <w:t>She'd run the whole corridor. Her chest was going like a bellows and her good fist was tight on Gage's splinter, and the earpiece cord had left a red spiral round her wrist that she could still feel. She didn't know if Gage's line was still open. She didn't let herself turn round. She'd stopped in the doorway behind Otto because the room had stopped her: the low lamp, the old faces, the man in black in the far door. And the arm had started to lift.</w:t>
       </w:r>
     </w:p>
     <w:p>
@@ -595,7 +595,7 @@
           <w:i w:val="0"/>
           <w:strike w:val="0"/>
         </w:rPr>
-        <w:t>It came out louder than she'd meant, in the voice she used on Gage when he was holding a wrench wrong. Every face in the room turned to her. The old woman in the shawl. The small man in green. The white-haired woman, who'd been looking at the man's wrist and now looked at Camilla's arm instead, at the elbow still lifted on its own. Flitzberg's eyes came to her and his hands came together, once, and parted.</w:t>
+        <w:t>It came out louder than she'd meant, in the voice she used on Gage when he was holding a wrench wrong. Every face but one turned to her. The old woman in the shawl. The small man in green. The white-haired woman, who'd been looking at the man's wrist and now looked at Camilla's arm instead, at the elbow still lifted on its own. Flitzberg's eyes came to her and his hands came together, once, and parted.</w:t>
       </w:r>
     </w:p>
     <w:p>
@@ -635,7 +635,7 @@
           <w:i w:val="0"/>
           <w:strike w:val="0"/>
         </w:rPr>
-        <w:t>Her good hand, the splinter still in it, had gone up to her collar, to the cord and the small pin on it, the one that answered first. She'd finished it a week ago. Two fingers found it. She held it, and let it go.</w:t>
+        <w:t>Her good hand, the splinter still in it, had gone up to her collar, to the cord and the small pin on it, her own switch, the one that answered first. She'd filed it at the sink weeks ago. Two fingers found it. She held it, and let it go.</w:t>
       </w:r>
     </w:p>
     <w:p>
@@ -655,23 +655,7 @@
           <w:i w:val="0"/>
           <w:strike w:val="0"/>
         </w:rPr>
-        <w:t xml:space="preserve">"It doesn't wait to see what you want," she said to the man. "It's listening to you being scared, and it does what scared people want before they've finished wanting it. That's all it's for." She looked past him, past the table, at the old man in gold with his bare hands on the wood. "And you're scared of </w:t>
-      </w:r>
-      <w:r>
-        <w:rPr>
-          <w:b w:val="0"/>
-          <w:i/>
-          <w:strike w:val="0"/>
-        </w:rPr>
-        <w:t>him</w:t>
-      </w:r>
-      <w:r>
-        <w:rPr>
-          <w:b w:val="0"/>
-          <w:i w:val="0"/>
-          <w:strike w:val="0"/>
-        </w:rPr>
-        <w:t>."</w:t>
+        <w:t>"It moves before you do," she said to the man. She looked past him at the old man in gold. "And it's moving at him."</w:t>
       </w:r>
     </w:p>
     <w:p>
@@ -701,7 +685,7 @@
           <w:i w:val="0"/>
           <w:strike w:val="0"/>
         </w:rPr>
-        <w:t>Behind her, someone came into the doorway and stopped at her shoulder, breathing as hard as she was. Grey-blue jacket, buttoned wrong by one hole. Camilla didn't turn round.</w:t>
+        <w:t>Behind her, someone came into the doorway and stopped at her shoulder, breathing as hard as she was. Grey-blue jacket, buttoned wrong by one hole. Camilla didn't look.</w:t>
       </w:r>
     </w:p>
     <w:p>
@@ -721,7 +705,7 @@
           <w:i w:val="0"/>
           <w:strike w:val="0"/>
         </w:rPr>
-        <w:t>Daren looked at the girl's metal hand, open at her side.</w:t>
+        <w:t>Daren looked at the girl's metal hand, open at her side because she'd told it to be.</w:t>
       </w:r>
     </w:p>
     <w:p>
@@ -731,23 +715,7 @@
           <w:i w:val="0"/>
           <w:strike w:val="0"/>
         </w:rPr>
-        <w:t xml:space="preserve">Then he looked at the old man. The Master was still looking at his ring. He hadn't looked up once, not when the lamp sang, not when the boy walked, not when the girl said </w:t>
-      </w:r>
-      <w:r>
-        <w:rPr>
-          <w:b w:val="0"/>
-          <w:i/>
-          <w:strike w:val="0"/>
-        </w:rPr>
-        <w:t>him</w:t>
-      </w:r>
-      <w:r>
-        <w:rPr>
-          <w:b w:val="0"/>
-          <w:i w:val="0"/>
-          <w:strike w:val="0"/>
-        </w:rPr>
-        <w:t>. Daren understood that he wasn't going to. He'd made his whole speech without once looking at the man he was handing over, and he would sit there through whatever came next with his eyes on a small gold hoop, as a man watches the weather through a window, because anything else in this room might look back.</w:t>
+        <w:t>Then he looked at the old man. The Master was still looking at his ring. He hadn't looked up once, not when the lamp sang, not when the boy walked, not when the girl named him. Daren understood that he wasn't going to. He'd made his whole speech without once looking at the man he was handing over, and he would sit there through whatever came next with his eyes on a small gold hoop.</w:t>
       </w:r>
     </w:p>
     <w:p>
@@ -828,7 +796,7 @@
           <w:i w:val="0"/>
           <w:strike w:val="0"/>
         </w:rPr>
-        <w:t>Pale. Paler than the rest of the arm, a band of skin that hadn't seen light since a chamber with black doors. The fine grain of the obsidian's inner face was printed into it, like a crease left on a cheek by a sheet. And the old ridge where Kubera's gold had sat against the heel of the hand, and a finger above it a new one, shallower, not yet finished. It looked like something half built and left out in the weather. It was bare.</w:t>
+        <w:t>Pale. Paler than the rest of the arm, a band of skin that hadn't seen light since a chamber with black doors. The fine grain of the obsidian's inner face was printed into it. And the old ridge where Kubera's gold had sat against the heel of the hand, and a finger above it a new one, shallower, not yet finished. It looked like something half built and left out in the weather. It was bare.</w:t>
       </w:r>
     </w:p>
     <w:p>
@@ -985,17 +953,6 @@
       <w:r>
         <w:rPr>
           <w:b w:val="0"/>
-          <w:i/>
-          <w:strike w:val="0"/>
-          <w:color w:val="5C6B7D"/>
-        </w:rPr>
-        <w:t>A door that is eager to break serves only its own story.</w:t>
-      </w:r>
-    </w:p>
-    <w:p>
-      <w:r>
-        <w:rPr>
-          <w:b w:val="0"/>
           <w:i w:val="0"/>
           <w:strike w:val="0"/>
         </w:rPr>
@@ -1029,7 +986,7 @@
           <w:i w:val="0"/>
           <w:strike w:val="0"/>
         </w:rPr>
-        <w:t>He stopped because she was there. His chest came up against nothing a hand's width from her, and he looked down at her like a door that had shut in a corridor he knew.</w:t>
+        <w:t>He stopped because she was there. His chest came up against nothing a hand's width from her, and he looked down at her for a long while.</w:t>
       </w:r>
     </w:p>
     <w:p>
@@ -1229,7 +1186,7 @@
           <w:i w:val="0"/>
           <w:strike w:val="0"/>
         </w:rPr>
-        <w:t>She'd sat once, when the band came off, and now she rose again in her two movements, a hand on the table's edge and then the rest, and Elara, who knew those two movements better than anyone in the room, felt her own hands go cold.</w:t>
+        <w:t>The Ancient One, who had sat when the band came off, rose again in her two movements, a hand on the table's edge and then the rest, and Elara, who knew those two movements better than anyone in the room, felt her own hands go cold.</w:t>
       </w:r>
     </w:p>
     <w:p>
@@ -1239,7 +1196,7 @@
           <w:i w:val="0"/>
           <w:strike w:val="0"/>
         </w:rPr>
-        <w:t>"You will want to know how I knew the Guard was active," the Ancient One said to the other three. Her voice was dry and small and carried to every wall. "For a hundred years, every order given to an instrument in Kubera, in Chanakya and in Ashoka has been written on a wall beneath my archive. Drona swore to this table that it was blind. Drona lied."</w:t>
+        <w:t>"You will want to know how I knew the Guard was active," she said to the other three. Her voice was dry and small and carried to every wall. "For a hundred years, every order given in the Guard's dialect, by any hand in Kubera, in Chanakya or in Ashoka has been written on a wall beneath my archive. Drona swore to this table that it was blind. Drona lied."</w:t>
       </w:r>
     </w:p>
     <w:p>

</xml_diff>

<commit_message>
Ch29 round 3: the lamp drops, Daren waits out the band on Camilla's beat, the band takes skin; trims
Co-Authored-By: Claude Opus 5.5 <noreply@anthropic.com>
</commit_message>
<xml_diff>
--- a/claude-notes/manuscript-v2/29-bare-wrist-merged.docx
+++ b/claude-notes/manuscript-v2/29-bare-wrist-merged.docx
@@ -415,7 +415,7 @@
           <w:i w:val="0"/>
           <w:strike w:val="0"/>
         </w:rPr>
-        <w:t>That was the whole of it. Vayun had told him what came after the fist: the stop, and not one blow after. Nobody had told him that sometimes the correct action was standing where you were with your hands open, and the stop came straight after it, and was the same thing. He worked it out on his feet. He didn't move his hands. He didn't step closer, though he could have, and he didn't step back. He gave the man's arm a boy to look at, and nothing in the boy to take hold of.</w:t>
+        <w:t>That was the whole of it. Vayun had told him what came after the fist: the stop, and not one blow after. Nobody had told him the stop could come first. He worked it out on his feet. He didn't move his hands. He didn't step closer, though he could have, and he didn't step back. He gave the man's arm a boy to look at, and nothing in the boy to take hold of.</w:t>
       </w:r>
     </w:p>
     <w:p>
@@ -545,7 +545,7 @@
           <w:i w:val="0"/>
           <w:strike w:val="0"/>
         </w:rPr>
-        <w:t>She knew that the way she'd known which of Pappy's gauges was lying, before she could have said why. The black thing on his wrist was talking, and her arm knew the voice. It had always known it. They'd been made out of the same idea. She could feel the shape of the thing's reach in her own shoulder, how it went out into the room and leaned toward the table, and she could feel what her arm did with it. Her arm came after. It always came after her, a beat behind, learning her. The thing on his wrist went before him, a heartbeat early. It didn't wait to learn anything.</w:t>
+        <w:t>She knew it before she could say how. The black thing on his wrist was talking, and her arm knew the voice. It had always known it. They'd been made out of the same idea. She could feel the shape of the thing's reach in her own shoulder, how it went out into the room and leaned toward the table, and she could feel what her arm did with it. Her arm came after. It always came after her, a beat behind, learning her. The thing on his wrist went before him, a heartbeat early. It didn't wait to learn anything.</w:t>
       </w:r>
     </w:p>
     <w:p>
@@ -575,7 +575,7 @@
           <w:i w:val="0"/>
           <w:strike w:val="0"/>
         </w:rPr>
-        <w:t>The man in black looked at the table again, and the space between the arm and the band opened wider, and the chain over the table ticked against its hook.</w:t>
+        <w:t>The man in black looked at the table again, and the space between the arm and the band opened wider, and the chain over the table slipped a link on its hook, and the lamp dropped a hand's width toward the old man's bare head and hung there, swinging.</w:t>
       </w:r>
     </w:p>
     <w:p>
@@ -625,7 +625,7 @@
           <w:i w:val="0"/>
           <w:strike w:val="0"/>
         </w:rPr>
-        <w:t>She found that it didn't matter. That was the odd thing. It sat in her chest, cold and steady. They'd been watching her hand for weeks, and every one of those weeks the hand had been hers. It had learned an egg without breaking it. It had held a splinter tonight without cracking it any further. Nobody reading it had made it do one thing.</w:t>
+        <w:t>It sat in her chest, cold and steady. They'd been watching her hand for weeks, and every one of those weeks the hand had been hers. It had learned an egg without breaking it. It had held a splinter tonight without cracking it any further.</w:t>
       </w:r>
     </w:p>
     <w:p>
@@ -675,7 +675,7 @@
           <w:i w:val="0"/>
           <w:strike w:val="0"/>
         </w:rPr>
-        <w:t>"I know everybody's looking at you," Camilla said. "Somebody's been reading my hand for weeks. I found out a few minutes ago. It's still my hand."</w:t>
+        <w:t>"Somebody's been reading my hand for weeks," Camilla said. "I found out a few minutes ago. It's still my hand."</w:t>
       </w:r>
     </w:p>
     <w:p>
@@ -715,7 +715,7 @@
           <w:i w:val="0"/>
           <w:strike w:val="0"/>
         </w:rPr>
-        <w:t>Then he looked at the old man. The Master was still looking at his ring. He hadn't looked up once, not when the lamp sang, not when the boy walked, not when the girl named him. Daren understood that he wasn't going to. He'd made his whole speech without once looking at the man he was handing over, and he would sit there through whatever came next with his eyes on a small gold hoop.</w:t>
+        <w:t>Then he looked at the old man. The Master was still looking at his ring. He hadn't looked up once, not when the lamp sang, not when it dropped toward his head, not when the boy walked, not when the girl turned the room on him. Daren understood that he wasn't going to. He'd made his whole speech without once looking at the man he was handing over, and he would sit there through whatever came next with his eyes on a small gold hoop.</w:t>
       </w:r>
     </w:p>
     <w:p>
@@ -763,6 +763,24 @@
       <w:r>
         <w:rPr>
           <w:b w:val="0"/>
+          <w:i/>
+          <w:strike w:val="0"/>
+        </w:rPr>
+        <w:t>It moves before you do.</w:t>
+      </w:r>
+      <w:r>
+        <w:rPr>
+          <w:b w:val="0"/>
+          <w:i w:val="0"/>
+          <w:strike w:val="0"/>
+        </w:rPr>
+        <w:t xml:space="preserve"> So he didn't move. He waited one beat, the girl's beat, until the band had reached for what he wanted and found he wanted nothing.</w:t>
+      </w:r>
+    </w:p>
+    <w:p>
+      <w:r>
+        <w:rPr>
+          <w:b w:val="0"/>
           <w:i w:val="0"/>
           <w:strike w:val="0"/>
         </w:rPr>
@@ -776,7 +794,7 @@
           <w:i w:val="0"/>
           <w:strike w:val="0"/>
         </w:rPr>
-        <w:t>The band was warm, and then, as it came away from the skin, it wasn't. It came off cold, all at once, the cold of a stone taken out of a river, and the lamp over the table stopped humming in the same instant, so that the quiet afterward was loud. The chain hung still. The bar in the door behind him settled into its bracket with a soft knock and didn't move again. At the table, the Ancient One sat down.</w:t>
+        <w:t>The band was warm, and then, as it came away from the skin, it wasn't. It came off cold, all at once, and took a strip of skin with it, and the lamp over the table stopped humming in the same instant, so that the quiet afterward was loud. The chain hung still. The bar in the door behind him settled into its bracket with a soft knock and didn't move again. At the table, the Ancient One sat down.</w:t>
       </w:r>
     </w:p>
     <w:p>
@@ -936,7 +954,7 @@
           <w:i w:val="0"/>
           <w:strike w:val="0"/>
         </w:rPr>
-        <w:t>He went past her.</w:t>
+        <w:t>He went past Elara without seeing her.</w:t>
       </w:r>
     </w:p>
     <w:p>
@@ -946,7 +964,7 @@
           <w:i w:val="0"/>
           <w:strike w:val="0"/>
         </w:rPr>
-        <w:t>He went past her and past the metal-armed girl and into the room, and his face had nothing in it at all. That was how she knew. She'd seen him angry. She'd seen him in the dead room with a notice in his coat, his back teeth set. This was further in than that. His right hand had closed, and the glue on the split knuckle had cracked across, and a bead of dark came up through the crack, and he didn't look at it. He was walking toward Daren, the man who'd killed Baju, at the pace of a man who has already decided where he'll be when he arrives.</w:t>
+        <w:t>He went past her and past the metal-armed girl and into the room, and his face had nothing in it at all. That was how she knew. She'd seen him angry. She'd seen him in the dead room with a notice in his coat, his back teeth set. This was further in than that. His right hand had closed, and the glue on the split knuckle had cracked across, and a bead of dark came up through the crack, and he didn't look at it. He was walking toward Daren, the man who'd killed Baju. He didn't speed up. He didn't need to.</w:t>
       </w:r>
     </w:p>
     <w:p>
@@ -1026,7 +1044,7 @@
           <w:i w:val="0"/>
           <w:strike w:val="0"/>
         </w:rPr>
-        <w:t>"It's off." She didn't look round at the table. She didn't have to. She could see it in his eyes: the black thing lying on the wood beside the rings, the soft notebook beside it, the man standing over both with his wrist bare and his hands open. "It's on the table. He took it off himself. He put Baju down next to it and said what he did." She held her voice level. It wanted to go up and she didn't let it. "Stop when the threat has ended. You taught that to five-year-olds."</w:t>
+        <w:t>"It's off." She didn't look round at the table. She didn't have to. She knew what was on the table: the black thing lying on the wood beside the rings, the soft notebook beside it, the man standing over both with his wrist bare and his hands open. "It's on the table. He took it off himself. He put Baju down next to it and said what he did." She held her voice level. It wanted to go up and she didn't let it. "Stop when the threat has ended. You taught that to five-year-olds."</w:t>
       </w:r>
     </w:p>
     <w:p>
@@ -1156,7 +1174,7 @@
           <w:i w:val="0"/>
           <w:strike w:val="0"/>
         </w:rPr>
-        <w:t>"There," he said. "The ridge. A finger above where the gold sits. That's where the obsidian sits." His voice was very even now, the voice from his old console, figures read off a sheet. "He told me the night he gave it to me. It is cold the first night. He knew because he'd lain awake under it. He knew what it fires on. He gave it to me anyway."</w:t>
+        <w:t>"There," he said. "The ridge. A finger above where the gold sits. That's where the obsidian sits." His voice was very even now. "He told me the night he gave it to me. It is cold the first night. He knew because he'd lain awake under it. He knew what it fires on. He gave it to me anyway."</w:t>
       </w:r>
     </w:p>
     <w:p>

</xml_diff>

<commit_message>
Ch29: merge the doubled 'went past'; show the raw strip on Daren's wrist
Co-Authored-By: Claude Opus 5.5 <noreply@anthropic.com>
</commit_message>
<xml_diff>
--- a/claude-notes/manuscript-v2/29-bare-wrist-merged.docx
+++ b/claude-notes/manuscript-v2/29-bare-wrist-merged.docx
@@ -814,7 +814,7 @@
           <w:i w:val="0"/>
           <w:strike w:val="0"/>
         </w:rPr>
-        <w:t>Pale. Paler than the rest of the arm, a band of skin that hadn't seen light since a chamber with black doors. The fine grain of the obsidian's inner face was printed into it. And the old ridge where Kubera's gold had sat against the heel of the hand, and a finger above it a new one, shallower, not yet finished. It looked like something half built and left out in the weather. It was bare.</w:t>
+        <w:t>Pale. Paler than the rest of the arm, a band of skin that hadn't seen light since a chamber with black doors. The fine grain of the obsidian's inner face was printed into it, raw along one edge where the skin had come away. And the old ridge where Kubera's gold had sat against the heel of the hand, and a finger above it a new one, shallower, not yet finished. It looked like something half built and left out in the weather. It was bare.</w:t>
       </w:r>
     </w:p>
     <w:p>
@@ -954,17 +954,7 @@
           <w:i w:val="0"/>
           <w:strike w:val="0"/>
         </w:rPr>
-        <w:t>He went past Elara without seeing her.</w:t>
-      </w:r>
-    </w:p>
-    <w:p>
-      <w:r>
-        <w:rPr>
-          <w:b w:val="0"/>
-          <w:i w:val="0"/>
-          <w:strike w:val="0"/>
-        </w:rPr>
-        <w:t>He went past her and past the metal-armed girl and into the room, and his face had nothing in it at all. That was how she knew. She'd seen him angry. She'd seen him in the dead room with a notice in his coat, his back teeth set. This was further in than that. His right hand had closed, and the glue on the split knuckle had cracked across, and a bead of dark came up through the crack, and he didn't look at it. He was walking toward Daren, the man who'd killed Baju. He didn't speed up. He didn't need to.</w:t>
+        <w:t>He went past Elara without seeing her, and past the metal-armed girl, and into the room, and his face had nothing in it at all. That was how she knew. She'd seen him angry. She'd seen him in the dead room with a notice in his coat, his back teeth set. This was further in than that. His right hand had closed, and the glue on the split knuckle had cracked across, and a bead of dark came up through the crack, and he didn't look at it. He was walking toward Daren, the man who'd killed Baju. He didn't speed up. He didn't need to.</w:t>
       </w:r>
     </w:p>
     <w:p>

</xml_diff>